<commit_message>
S2: fix syllabus grading breakdown to match live 20/10/40/0/30 gradebook weights
</commit_message>
<xml_diff>
--- a/downloads/World_History_Syllabus_Live.docx
+++ b/downloads/World_History_Syllabus_Live.docx
@@ -1267,10 +1267,10 @@
           <w:b/>
           <w:color w:val="C7922C"/>
         </w:rPr>
-        <w:t xml:space="preserve">60%  </w:t>
+        <w:t xml:space="preserve">40%  </w:t>
       </w:r>
       <w:r>
-        <w:t>Asynchronous homework (reading quizzes, primary source reports, VR activity write-ups)</w:t>
+        <w:t>Deep Feedback assignments: Critical Questions, Primary Source Exercises, VR Activity write-ups, and quarter capstones, each graded with a rubric</w:t>
       </w:r>
     </w:p>
     <w:p>
@@ -1285,7 +1285,22 @@
         <w:t xml:space="preserve">30%  </w:t>
       </w:r>
       <w:r>
-        <w:t>Projects (extended primary source analyses and quarter capstone submissions)</w:t>
+        <w:t>Quarterly Exams: one at the end of each quarter, covering that quarter only</w:t>
+      </w:r>
+    </w:p>
+    <w:p>
+      <w:pPr>
+        <w:pStyle w:val="ListBullet"/>
+      </w:pPr>
+      <w:r>
+        <w:rPr>
+          <w:b/>
+          <w:color w:val="C7922C"/>
+        </w:rPr>
+        <w:t xml:space="preserve">20%  </w:t>
+      </w:r>
+      <w:r>
+        <w:t>Reading Quizzes: one per week, auto-graded</w:t>
       </w:r>
     </w:p>
     <w:p>
@@ -1300,7 +1315,17 @@
         <w:t xml:space="preserve">10%  </w:t>
       </w:r>
       <w:r>
-        <w:t>Synchronous homework &amp; activities (live class participation and discussion)</w:t>
+        <w:t>Discussions: one per module</w:t>
+      </w:r>
+    </w:p>
+    <w:p>
+      <w:r>
+        <w:rPr>
+          <w:i/>
+          <w:color w:val="666666"/>
+          <w:sz w:val="19"/>
+        </w:rPr>
+        <w:t>Module check-in surveys at the start and end of each module are ungraded and do not count toward this weighting; your teacher uses them to see how the class is doing.</w:t>
       </w:r>
     </w:p>
     <w:p>

</xml_diff>